<commit_message>
saving custom model file
</commit_message>
<xml_diff>
--- a/EECS_738_machine_learning/lab4/Lab 4.docx
+++ b/EECS_738_machine_learning/lab4/Lab 4.docx
@@ -1634,39 +1634,6 @@
         <w:rPr>
           <w:lang w:val="en-US"/>
         </w:rPr>
-        <w:t>The customized model contains an architecture like below.</w:t>
-      </w:r>
-    </w:p>
-    <w:p>
-      <w:pPr>
-        <w:rPr>
-          <w:lang w:val="en-US"/>
-        </w:rPr>
-      </w:pPr>
-      <w:r>
-        <w:rPr>
-          <w:lang w:val="en-US"/>
-        </w:rPr>
-        <w:br w:type="page"/>
-      </w:r>
-    </w:p>
-    <w:p>
-      <w:pPr>
-        <w:rPr>
-          <w:lang w:val="en-US"/>
-        </w:rPr>
-      </w:pPr>
-    </w:p>
-    <w:p>
-      <w:pPr>
-        <w:rPr>
-          <w:lang w:val="en-US"/>
-        </w:rPr>
-      </w:pPr>
-      <w:r>
-        <w:rPr>
-          <w:lang w:val="en-US"/>
-        </w:rPr>
         <w:t xml:space="preserve">According to the empirical experience during parameter tuning, </w:t>
       </w:r>
       <w:r>
@@ -1775,7 +1742,14 @@
         <w:rPr>
           <w:lang w:val="en-US"/>
         </w:rPr>
-        <w:t xml:space="preserve"> It’s quite possible that increasing the block skips involves deeper layers per residual block, where gradient vanishing would </w:t>
+        <w:t xml:space="preserve"> It’s quite possible that increasing the block skips involves deeper </w:t>
+      </w:r>
+      <w:r>
+        <w:rPr>
+          <w:lang w:val="en-US"/>
+        </w:rPr>
+        <w:lastRenderedPageBreak/>
+        <w:t xml:space="preserve">layers per residual block, where gradient vanishing would </w:t>
       </w:r>
       <w:r>
         <w:rPr>

</xml_diff>